<commit_message>
Add AI Transformation & Value Realization page and explainer video
- New route /solutions/ai-transformation (hero, answer, workstreams + video, 6-step HowTo,
  strategy-to-production section linking the other solution pages, why + anonymized AI proof,
  answers, 11 FAQs, contact)
- Decisions: "AI Readiness Assessment" entry offer (no week count), clients anonymous,
  platforms named (Azure, AWS, Azure OpenAI, AWS Bedrock, OpenAI, Gemini)
- JSON-LD: Service with isRelatedTo sibling pages, Organization hasCredential, VideoObject
- Strategy doc updated with resolved open items; page listed in navbar, footer and sitemap

Co-Authored-By: Claude Opus 5.5 <noreply@anthropic.com>
Claude-Session: https://claude.ai/code/session_013wwRamYmoaCu2Jj7xRXZqL
</commit_message>
<xml_diff>
--- a/docs/AI-Transformation-Value-Realization-Strategy.docx
+++ b/docs/AI-Transformation-Value-Realization-Strategy.docx
@@ -334,7 +334,7 @@
           <w:sz w:val="21"/>
           <w:szCs w:val="21"/>
         </w:rPr>
-        <w:t xml:space="preserve"> an AI Readiness Assessment that delivers an AI maturity heatmap, a prioritized use-case portfolio with business cases and an execution-ready roadmap. No week count is published until Delivery confirms it.</w:t>
+        <w:t xml:space="preserve"> an AI Readiness Assessment that delivers an AI maturity heatmap, a prioritized use-case portfolio with business cases and an execution-ready roadmap. Name agreed; no week count is published until Delivery confirms it.</w:t>
       </w:r>
     </w:p>
     <w:p>
@@ -26152,7 +26152,7 @@
                 <w:sz w:val="18"/>
                 <w:szCs w:val="18"/>
               </w:rPr>
-              <w:t xml:space="preserve">Confirm the entry-offer name ("AI Readiness Assessment") and its length; the page shows no week count until confirmed</w:t>
+              <w:t xml:space="preserve">Entry offer: AGREED as "AI Readiness Assessment" (Raul, Oct 15). Length OPEN; the page shows no week count</w:t>
             </w:r>
           </w:p>
         </w:tc>
@@ -26251,7 +26251,7 @@
                 <w:sz w:val="18"/>
                 <w:szCs w:val="18"/>
               </w:rPr>
-              <w:t xml:space="preserve">Approve the six anonymized proof points, or allow client names (Hibbett Sports, Zilliant, Demandbase, etc.)</w:t>
+              <w:t xml:space="preserve">Client names: KEEP ANONYMOUS for now (Raul, Oct 15)</w:t>
             </w:r>
           </w:p>
         </w:tc>
@@ -26315,7 +26315,7 @@
                 <w:sz w:val="18"/>
                 <w:szCs w:val="18"/>
               </w:rPr>
-              <w:t xml:space="preserve">Named clients are stronger trust signals for buyers and AI engines</w:t>
+              <w:t xml:space="preserve">Revisit when references are approved</w:t>
             </w:r>
           </w:p>
         </w:tc>
@@ -26351,7 +26351,7 @@
                 <w:sz w:val="18"/>
                 <w:szCs w:val="18"/>
               </w:rPr>
-              <w:t xml:space="preserve">Confirm platforms to name: Azure and AWS are confirmed; Azure OpenAI, AWS Bedrock, OpenAI and Gemini come from project records</w:t>
+              <w:t xml:space="preserve">Platforms: APPROVED to name Azure, AWS, Azure OpenAI, AWS Bedrock, OpenAI and Google Gemini (Raul, Oct 15)</w:t>
             </w:r>
           </w:p>
         </w:tc>
@@ -26413,7 +26413,7 @@
                 <w:sz w:val="18"/>
                 <w:szCs w:val="18"/>
               </w:rPr>
-              <w:t xml:space="preserve">The platforms FAQ names them</w:t>
+              <w:t xml:space="preserve">Named in the platforms FAQ</w:t>
             </w:r>
           </w:p>
         </w:tc>
@@ -26450,7 +26450,7 @@
                 <w:sz w:val="18"/>
                 <w:szCs w:val="18"/>
               </w:rPr>
-              <w:t xml:space="preserve">Confirm who leads strategy engagements (named senior advisors with bios)</w:t>
+              <w:t xml:space="preserve">Named senior advisors: NOT FOR NOW (Raul, Oct 15)</w:t>
             </w:r>
           </w:p>
         </w:tc>
@@ -26514,7 +26514,7 @@
                 <w:sz w:val="18"/>
                 <w:szCs w:val="18"/>
               </w:rPr>
-              <w:t xml:space="preserve">Author and expert entities strengthen E-E-A-T and AI citations</w:t>
+              <w:t xml:space="preserve">Add bios later to strengthen E-E-A-T and AI citations</w:t>
             </w:r>
           </w:p>
         </w:tc>
@@ -26649,7 +26649,7 @@
                 <w:sz w:val="18"/>
                 <w:szCs w:val="18"/>
               </w:rPr>
-              <w:t xml:space="preserve">Build the page and the explainer video in team-solutions-site</w:t>
+              <w:t xml:space="preserve">Page and video: BUILT in team-solutions-site (/solutions/ai-transformation)</w:t>
             </w:r>
           </w:p>
         </w:tc>
@@ -26713,7 +26713,7 @@
                 <w:sz w:val="18"/>
                 <w:szCs w:val="18"/>
               </w:rPr>
-              <w:t xml:space="preserve">Next step after approval</w:t>
+              <w:t xml:space="preserve">Review on Vercel after git push</w:t>
             </w:r>
           </w:p>
         </w:tc>
@@ -26739,7 +26739,7 @@
         </w:numPr>
         <w:spacing w:after="80"/>
       </w:pPr>
-      <w:hyperlink w:history="1" r:id="rIdmescypdliiwmhoimhqdkk">
+      <w:hyperlink w:history="1" r:id="rIdwrtupu__wadnnpj8xha7l">
         <w:r>
           <w:rPr>
             <w:rFonts w:ascii="Aptos" w:cs="Aptos" w:eastAsia="Aptos" w:hAnsi="Aptos"/>
@@ -26761,7 +26761,7 @@
         </w:numPr>
         <w:spacing w:after="80"/>
       </w:pPr>
-      <w:hyperlink w:history="1" r:id="rIdz-apljc3zacpmytehekdx">
+      <w:hyperlink w:history="1" r:id="rId1uflyssupalkqkszlg_b4">
         <w:r>
           <w:rPr>
             <w:rFonts w:ascii="Aptos" w:cs="Aptos" w:eastAsia="Aptos" w:hAnsi="Aptos"/>
@@ -26783,7 +26783,7 @@
         </w:numPr>
         <w:spacing w:after="80"/>
       </w:pPr>
-      <w:hyperlink w:history="1" r:id="rId2ggk7wvhyrnwncfhdarl_">
+      <w:hyperlink w:history="1" r:id="rIdfdgd6cbh1rray7lbsdgg7">
         <w:r>
           <w:rPr>
             <w:rFonts w:ascii="Aptos" w:cs="Aptos" w:eastAsia="Aptos" w:hAnsi="Aptos"/>
@@ -26805,7 +26805,7 @@
         </w:numPr>
         <w:spacing w:after="80"/>
       </w:pPr>
-      <w:hyperlink w:history="1" r:id="rId8h027oxmyve2736mj9ukq">
+      <w:hyperlink w:history="1" r:id="rIdiey4rfv9hopjgazvs1nns">
         <w:r>
           <w:rPr>
             <w:rFonts w:ascii="Aptos" w:cs="Aptos" w:eastAsia="Aptos" w:hAnsi="Aptos"/>
@@ -26827,7 +26827,7 @@
         </w:numPr>
         <w:spacing w:after="80"/>
       </w:pPr>
-      <w:hyperlink w:history="1" r:id="rIdwi3x9jzulicqrqxapv6ho">
+      <w:hyperlink w:history="1" r:id="rId_oy5awxdw8xtafcisf2gr">
         <w:r>
           <w:rPr>
             <w:rFonts w:ascii="Aptos" w:cs="Aptos" w:eastAsia="Aptos" w:hAnsi="Aptos"/>
@@ -26849,7 +26849,7 @@
         </w:numPr>
         <w:spacing w:after="80"/>
       </w:pPr>
-      <w:hyperlink w:history="1" r:id="rIdgtfxbpaxo8ob57gwdfrdk">
+      <w:hyperlink w:history="1" r:id="rId3oftowkssslstewjcc8le">
         <w:r>
           <w:rPr>
             <w:rFonts w:ascii="Aptos" w:cs="Aptos" w:eastAsia="Aptos" w:hAnsi="Aptos"/>
@@ -26871,7 +26871,7 @@
         </w:numPr>
         <w:spacing w:after="80"/>
       </w:pPr>
-      <w:hyperlink w:history="1" r:id="rIdtckk7f2vwjfb4r41bd-cb">
+      <w:hyperlink w:history="1" r:id="rIdndk5jetewl8klohtgocsc">
         <w:r>
           <w:rPr>
             <w:rFonts w:ascii="Aptos" w:cs="Aptos" w:eastAsia="Aptos" w:hAnsi="Aptos"/>

</xml_diff>